<commit_message>
feat: implement asset status transfer (alih-status) module with workflows for applications, research minutes, and decrees
</commit_message>
<xml_diff>
--- a/public/template/alih-status/nodin.docx
+++ b/public/template/alih-status/nodin.docx
@@ -98,7 +98,7 @@
                           <pic:cNvPicPr preferRelativeResize="0"/>
                         </pic:nvPicPr>
                         <pic:blipFill>
-                          <a:blip r:embed="rId7"/>
+                          <a:blip r:embed="rId8"/>
                           <a:srcRect/>
                           <a:stretch>
                             <a:fillRect/>
@@ -869,147 +869,1199 @@
     </w:p>
     <w:p>
       <w:pPr>
+        <w:spacing w:after="120" w:line="360" w:lineRule="auto"/>
+        <w:ind w:firstLine="720"/>
+        <w:jc w:val="both"/>
+        <w:rPr>
+          <w:rFonts w:ascii="Arial" w:eastAsia="Arial" w:hAnsi="Arial" w:cs="Arial"/>
+          <w:sz w:val="24"/>
+          <w:szCs w:val="24"/>
+        </w:rPr>
+      </w:pPr>
+      <w:r>
+        <w:rPr>
+          <w:rFonts w:ascii="Arial" w:eastAsia="Arial" w:hAnsi="Arial" w:cs="Arial"/>
+          <w:sz w:val="24"/>
+          <w:szCs w:val="24"/>
+          <w:highlight w:val="green"/>
+        </w:rPr>
+        <w:t>{#</w:t>
+      </w:r>
+      <w:r>
+        <w:rPr>
+          <w:rFonts w:ascii="Arial" w:eastAsia="Arial" w:hAnsi="Arial" w:cs="Arial"/>
+          <w:sz w:val="24"/>
+          <w:szCs w:val="24"/>
+          <w:highlight w:val="green"/>
+        </w:rPr>
+        <w:t>ba-penelitian</w:t>
+      </w:r>
+      <w:r>
+        <w:rPr>
+          <w:rFonts w:ascii="Arial" w:eastAsia="Arial" w:hAnsi="Arial" w:cs="Arial"/>
+          <w:sz w:val="24"/>
+          <w:szCs w:val="24"/>
+          <w:highlight w:val="green"/>
+        </w:rPr>
+        <w:t>-tunggal}</w:t>
+      </w:r>
+    </w:p>
+    <w:p>
+      <w:pPr>
         <w:numPr>
           <w:ilvl w:val="0"/>
-          <w:numId w:val="1"/>
+          <w:numId w:val="2"/>
         </w:numPr>
-        <w:spacing w:before="240" w:after="0" w:line="360" w:lineRule="auto"/>
+        <w:pBdr>
+          <w:top w:val="nil"/>
+          <w:left w:val="nil"/>
+          <w:bottom w:val="nil"/>
+          <w:right w:val="nil"/>
+          <w:between w:val="nil"/>
+        </w:pBdr>
+        <w:tabs>
+          <w:tab w:val="left" w:pos="1440"/>
+        </w:tabs>
+        <w:spacing w:after="0" w:line="360" w:lineRule="auto"/>
+        <w:ind w:left="426" w:right="46"/>
         <w:jc w:val="both"/>
         <w:rPr>
           <w:rFonts w:ascii="Arial" w:eastAsia="Arial" w:hAnsi="Arial" w:cs="Arial"/>
-          <w:sz w:val="24"/>
-          <w:szCs w:val="24"/>
-        </w:rPr>
-      </w:pPr>
-      <w:r>
-        <w:rPr>
-          <w:rFonts w:ascii="Arial" w:eastAsia="Arial" w:hAnsi="Arial" w:cs="Arial"/>
-          <w:sz w:val="24"/>
-          <w:szCs w:val="24"/>
-        </w:rPr>
-        <w:t>Permohonan pengalihan status penggunaan barang milik daerah yang diajukan oleh Perangkat Daerah sebagaimana tercantum dalam lampiran telah sesuai dengan ketentuan peraturan perundang-undangan yang berlaku.</w:t>
+          <w:color w:val="000000"/>
+          <w:sz w:val="24"/>
+          <w:szCs w:val="24"/>
+        </w:rPr>
+      </w:pPr>
+      <w:r>
+        <w:rPr>
+          <w:rFonts w:ascii="Arial" w:eastAsia="Arial" w:hAnsi="Arial" w:cs="Arial"/>
+          <w:sz w:val="24"/>
+          <w:szCs w:val="24"/>
+        </w:rPr>
+        <w:t xml:space="preserve">Permohonan pengalihan status penggunaan barang milik daerah yang diajukan oleh </w:t>
+      </w:r>
+      <w:r>
+        <w:rPr>
+          <w:rFonts w:ascii="Arial" w:eastAsia="Arial" w:hAnsi="Arial" w:cs="Arial"/>
+          <w:sz w:val="24"/>
+          <w:szCs w:val="24"/>
+          <w:highlight w:val="yellow"/>
+        </w:rPr>
+        <w:t>{perangkat-daerah-asal}</w:t>
+      </w:r>
+      <w:r>
+        <w:rPr>
+          <w:rFonts w:ascii="Arial" w:eastAsia="Arial" w:hAnsi="Arial" w:cs="Arial"/>
+          <w:sz w:val="24"/>
+          <w:szCs w:val="24"/>
+        </w:rPr>
+        <w:t xml:space="preserve"> sebagaimana tercantum dalam lampiran telah sesuai dengan ketentuan peraturan perundang-undangan yang berlaku.</w:t>
       </w:r>
     </w:p>
     <w:p>
       <w:pPr>
         <w:numPr>
           <w:ilvl w:val="0"/>
-          <w:numId w:val="1"/>
+          <w:numId w:val="2"/>
         </w:numPr>
+        <w:pBdr>
+          <w:top w:val="nil"/>
+          <w:left w:val="nil"/>
+          <w:bottom w:val="nil"/>
+          <w:right w:val="nil"/>
+          <w:between w:val="nil"/>
+        </w:pBdr>
+        <w:tabs>
+          <w:tab w:val="left" w:pos="1440"/>
+        </w:tabs>
         <w:spacing w:after="0" w:line="360" w:lineRule="auto"/>
+        <w:ind w:left="426" w:right="46"/>
         <w:jc w:val="both"/>
         <w:rPr>
           <w:rFonts w:ascii="Arial" w:eastAsia="Arial" w:hAnsi="Arial" w:cs="Arial"/>
-          <w:sz w:val="24"/>
-          <w:szCs w:val="24"/>
-        </w:rPr>
-      </w:pPr>
-      <w:r>
-        <w:rPr>
-          <w:rFonts w:ascii="Arial" w:eastAsia="Arial" w:hAnsi="Arial" w:cs="Arial"/>
-          <w:sz w:val="24"/>
-          <w:szCs w:val="24"/>
-        </w:rPr>
-        <w:t>Barang milik daerah Pemerintah Kabupaten Pasuruan yang menjadi objek pengalihan status penggunaan terdiri atas beberapa jenis barang dengan rincian sebagaimana tercantum dalam lampiran.</w:t>
+          <w:color w:val="000000"/>
+          <w:sz w:val="24"/>
+          <w:szCs w:val="24"/>
+        </w:rPr>
+      </w:pPr>
+      <w:r>
+        <w:rPr>
+          <w:rFonts w:ascii="Arial" w:eastAsia="Arial" w:hAnsi="Arial" w:cs="Arial"/>
+          <w:color w:val="000000"/>
+          <w:sz w:val="24"/>
+          <w:szCs w:val="24"/>
+        </w:rPr>
+        <w:t xml:space="preserve">Permohonan tersebut telah diteliti oleh Tim Penelitian Penggunaan Barang Milik Daerah </w:t>
+      </w:r>
+      <w:r>
+        <w:rPr>
+          <w:rFonts w:ascii="Arial" w:eastAsia="Arial" w:hAnsi="Arial" w:cs="Arial"/>
+          <w:color w:val="000000"/>
+          <w:sz w:val="24"/>
+          <w:szCs w:val="24"/>
+        </w:rPr>
+        <w:t xml:space="preserve">sebagaimana </w:t>
+      </w:r>
+      <w:r>
+        <w:rPr>
+          <w:rFonts w:ascii="Arial" w:eastAsia="Arial" w:hAnsi="Arial" w:cs="Arial"/>
+          <w:color w:val="000000"/>
+          <w:sz w:val="24"/>
+          <w:szCs w:val="24"/>
+        </w:rPr>
+        <w:t>berita acara penelitian</w:t>
+      </w:r>
+      <w:r>
+        <w:rPr>
+          <w:rFonts w:ascii="Arial" w:eastAsia="Arial" w:hAnsi="Arial" w:cs="Arial"/>
+          <w:color w:val="000000"/>
+          <w:sz w:val="24"/>
+          <w:szCs w:val="24"/>
+        </w:rPr>
+        <w:t xml:space="preserve"> nomor </w:t>
+      </w:r>
+      <w:r>
+        <w:rPr>
+          <w:rFonts w:ascii="Arial" w:eastAsia="Arial" w:hAnsi="Arial" w:cs="Arial"/>
+          <w:sz w:val="24"/>
+          <w:szCs w:val="24"/>
+          <w:highlight w:val="yellow"/>
+        </w:rPr>
+        <w:t>{</w:t>
+      </w:r>
+      <w:r>
+        <w:rPr>
+          <w:rFonts w:ascii="Arial" w:eastAsia="Arial" w:hAnsi="Arial" w:cs="Arial"/>
+          <w:sz w:val="24"/>
+          <w:szCs w:val="24"/>
+          <w:highlight w:val="yellow"/>
+        </w:rPr>
+        <w:t>ba-penelitian</w:t>
+      </w:r>
+      <w:r>
+        <w:rPr>
+          <w:rFonts w:ascii="Arial" w:eastAsia="Arial" w:hAnsi="Arial" w:cs="Arial"/>
+          <w:sz w:val="24"/>
+          <w:szCs w:val="24"/>
+          <w:highlight w:val="yellow"/>
+        </w:rPr>
+        <w:t>-nomor}</w:t>
+      </w:r>
+      <w:r>
+        <w:rPr>
+          <w:rFonts w:ascii="Arial" w:eastAsia="Arial" w:hAnsi="Arial" w:cs="Arial"/>
+          <w:color w:val="000000"/>
+          <w:sz w:val="24"/>
+          <w:szCs w:val="24"/>
+        </w:rPr>
+        <w:t xml:space="preserve"> tanggal </w:t>
+      </w:r>
+      <w:r>
+        <w:rPr>
+          <w:rFonts w:ascii="Arial" w:eastAsia="Arial" w:hAnsi="Arial" w:cs="Arial"/>
+          <w:sz w:val="24"/>
+          <w:szCs w:val="24"/>
+          <w:highlight w:val="yellow"/>
+        </w:rPr>
+        <w:t>{</w:t>
+      </w:r>
+      <w:r>
+        <w:rPr>
+          <w:rFonts w:ascii="Arial" w:eastAsia="Arial" w:hAnsi="Arial" w:cs="Arial"/>
+          <w:sz w:val="24"/>
+          <w:szCs w:val="24"/>
+          <w:highlight w:val="yellow"/>
+        </w:rPr>
+        <w:t>ba-penelitian</w:t>
+      </w:r>
+      <w:r>
+        <w:rPr>
+          <w:rFonts w:ascii="Arial" w:eastAsia="Arial" w:hAnsi="Arial" w:cs="Arial"/>
+          <w:sz w:val="24"/>
+          <w:szCs w:val="24"/>
+          <w:highlight w:val="yellow"/>
+        </w:rPr>
+        <w:t>-tanggal}</w:t>
+      </w:r>
+      <w:r>
+        <w:rPr>
+          <w:rFonts w:ascii="Arial" w:eastAsia="Arial" w:hAnsi="Arial" w:cs="Arial"/>
+          <w:color w:val="000000"/>
+          <w:sz w:val="24"/>
+          <w:szCs w:val="24"/>
+        </w:rPr>
+        <w:t>.</w:t>
       </w:r>
     </w:p>
     <w:p>
       <w:pPr>
         <w:numPr>
           <w:ilvl w:val="0"/>
-          <w:numId w:val="1"/>
+          <w:numId w:val="2"/>
         </w:numPr>
-        <w:spacing w:after="240" w:line="360" w:lineRule="auto"/>
+        <w:pBdr>
+          <w:top w:val="nil"/>
+          <w:left w:val="nil"/>
+          <w:bottom w:val="nil"/>
+          <w:right w:val="nil"/>
+          <w:between w:val="nil"/>
+        </w:pBdr>
+        <w:tabs>
+          <w:tab w:val="left" w:pos="1440"/>
+        </w:tabs>
+        <w:spacing w:after="0" w:line="360" w:lineRule="auto"/>
+        <w:ind w:left="425" w:right="45" w:hanging="357"/>
         <w:jc w:val="both"/>
         <w:rPr>
           <w:rFonts w:ascii="Arial" w:eastAsia="Arial" w:hAnsi="Arial" w:cs="Arial"/>
-          <w:sz w:val="24"/>
-          <w:szCs w:val="24"/>
-        </w:rPr>
-      </w:pPr>
-      <w:r>
-        <w:rPr>
-          <w:rFonts w:ascii="Arial" w:eastAsia="Arial" w:hAnsi="Arial" w:cs="Arial"/>
-          <w:sz w:val="24"/>
-          <w:szCs w:val="24"/>
-        </w:rPr>
-        <w:t>Barang milik daerah tersebut akan dialihkan status penggunaannya kepada Perangkat Daerah penerima sebagaimana tercantum dalam lampiran sesuai dengan kebutuhan penyelenggaraan tugas dan fungsi masing-masing Perangkat Daerah.</w:t>
-      </w:r>
+        </w:rPr>
+      </w:pPr>
+      <w:bookmarkStart w:id="1" w:name="_8z80am6mpvdl" w:colFirst="0" w:colLast="0"/>
+      <w:bookmarkEnd w:id="1"/>
+      <w:r>
+        <w:rPr>
+          <w:rFonts w:ascii="Arial" w:eastAsia="Arial" w:hAnsi="Arial" w:cs="Arial"/>
+          <w:sz w:val="24"/>
+          <w:szCs w:val="24"/>
+        </w:rPr>
+        <w:t xml:space="preserve">Barang Milik Daerah sebagaimana dimaksud dalam poin 1 </w:t>
+      </w:r>
+      <w:r>
+        <w:rPr>
+          <w:rFonts w:ascii="Arial" w:eastAsia="Arial" w:hAnsi="Arial" w:cs="Arial"/>
+          <w:color w:val="000000"/>
+          <w:sz w:val="24"/>
+          <w:szCs w:val="24"/>
+        </w:rPr>
+        <w:t xml:space="preserve">merupakan barang milik </w:t>
+      </w:r>
+      <w:r>
+        <w:rPr>
+          <w:rFonts w:ascii="Arial" w:eastAsia="Arial" w:hAnsi="Arial" w:cs="Arial"/>
+          <w:sz w:val="24"/>
+          <w:szCs w:val="24"/>
+        </w:rPr>
+        <w:t>daerah</w:t>
+      </w:r>
+      <w:r>
+        <w:rPr>
+          <w:rFonts w:ascii="Arial" w:eastAsia="Arial" w:hAnsi="Arial" w:cs="Arial"/>
+          <w:color w:val="000000"/>
+          <w:sz w:val="24"/>
+          <w:szCs w:val="24"/>
+        </w:rPr>
+        <w:t xml:space="preserve"> yang tercatat di </w:t>
+      </w:r>
+      <w:r>
+        <w:rPr>
+          <w:rFonts w:ascii="Arial" w:eastAsia="Arial" w:hAnsi="Arial" w:cs="Arial"/>
+          <w:sz w:val="24"/>
+          <w:szCs w:val="24"/>
+        </w:rPr>
+        <w:t xml:space="preserve">aplikasi E-BMD </w:t>
+      </w:r>
+      <w:r>
+        <w:rPr>
+          <w:rFonts w:ascii="Arial" w:eastAsia="Arial" w:hAnsi="Arial" w:cs="Arial"/>
+          <w:sz w:val="24"/>
+          <w:szCs w:val="24"/>
+          <w:highlight w:val="yellow"/>
+        </w:rPr>
+        <w:t>{perangkat-daerah-asal}</w:t>
+      </w:r>
+      <w:r>
+        <w:rPr>
+          <w:rFonts w:ascii="Arial" w:eastAsia="Arial" w:hAnsi="Arial" w:cs="Arial"/>
+          <w:color w:val="000000"/>
+          <w:sz w:val="24"/>
+          <w:szCs w:val="24"/>
+        </w:rPr>
+        <w:t xml:space="preserve"> dengan nilai perolehan sebesar </w:t>
+      </w:r>
+      <w:r>
+        <w:rPr>
+          <w:rFonts w:ascii="Arial" w:eastAsia="Arial" w:hAnsi="Arial" w:cs="Arial"/>
+          <w:sz w:val="24"/>
+          <w:szCs w:val="24"/>
+          <w:highlight w:val="yellow"/>
+        </w:rPr>
+        <w:t>{total-perolehan}</w:t>
+      </w:r>
+      <w:r>
+        <w:rPr>
+          <w:rFonts w:ascii="Arial" w:eastAsia="Arial" w:hAnsi="Arial" w:cs="Arial"/>
+          <w:sz w:val="24"/>
+          <w:szCs w:val="24"/>
+          <w:highlight w:val="yellow"/>
+        </w:rPr>
+        <w:t xml:space="preserve"> </w:t>
+      </w:r>
+      <w:r>
+        <w:rPr>
+          <w:rFonts w:ascii="Arial" w:eastAsia="Arial" w:hAnsi="Arial" w:cs="Arial"/>
+          <w:sz w:val="24"/>
+          <w:szCs w:val="24"/>
+        </w:rPr>
+        <w:t>dengan rincian sebagaimana terlampir</w:t>
+      </w:r>
+      <w:r>
+        <w:rPr>
+          <w:rFonts w:ascii="Arial" w:eastAsia="Arial" w:hAnsi="Arial" w:cs="Arial"/>
+          <w:color w:val="000000"/>
+          <w:sz w:val="24"/>
+          <w:szCs w:val="24"/>
+        </w:rPr>
+        <w:t>.</w:t>
+      </w:r>
+      <w:bookmarkStart w:id="2" w:name="_9jzazzo7c6g9" w:colFirst="0" w:colLast="0"/>
+      <w:bookmarkEnd w:id="2"/>
     </w:p>
     <w:p>
       <w:pPr>
-        <w:spacing w:before="240" w:after="240" w:line="360" w:lineRule="auto"/>
-        <w:ind w:left="720"/>
+        <w:numPr>
+          <w:ilvl w:val="0"/>
+          <w:numId w:val="2"/>
+        </w:numPr>
+        <w:pBdr>
+          <w:top w:val="nil"/>
+          <w:left w:val="nil"/>
+          <w:bottom w:val="nil"/>
+          <w:right w:val="nil"/>
+          <w:between w:val="nil"/>
+        </w:pBdr>
+        <w:tabs>
+          <w:tab w:val="left" w:pos="1440"/>
+        </w:tabs>
+        <w:spacing w:after="0" w:line="360" w:lineRule="auto"/>
+        <w:ind w:left="425" w:right="45" w:hanging="357"/>
         <w:jc w:val="both"/>
         <w:rPr>
           <w:rFonts w:ascii="Arial" w:eastAsia="Arial" w:hAnsi="Arial" w:cs="Arial"/>
-          <w:sz w:val="24"/>
-          <w:szCs w:val="24"/>
-        </w:rPr>
-      </w:pPr>
+        </w:rPr>
+      </w:pPr>
+      <w:r>
+        <w:rPr>
+          <w:rFonts w:ascii="Arial" w:eastAsia="Arial" w:hAnsi="Arial" w:cs="Arial"/>
+          <w:sz w:val="24"/>
+          <w:szCs w:val="24"/>
+        </w:rPr>
+        <w:t xml:space="preserve">Barang milik daerah tersebut akan dialih status kepada </w:t>
+      </w:r>
+      <w:r>
+        <w:rPr>
+          <w:rFonts w:ascii="Arial" w:eastAsia="Arial" w:hAnsi="Arial" w:cs="Arial"/>
+          <w:sz w:val="24"/>
+          <w:szCs w:val="24"/>
+          <w:highlight w:val="yellow"/>
+        </w:rPr>
+        <w:t>{perangkat-daerah-tujuan}</w:t>
+      </w:r>
+      <w:r>
+        <w:rPr>
+          <w:rFonts w:ascii="Arial" w:eastAsia="Arial" w:hAnsi="Arial" w:cs="Arial"/>
+          <w:sz w:val="24"/>
+          <w:szCs w:val="24"/>
+        </w:rPr>
+        <w:t>.</w:t>
+      </w:r>
     </w:p>
     <w:p>
       <w:pPr>
-        <w:spacing w:before="240" w:after="240" w:line="360" w:lineRule="auto"/>
-        <w:ind w:left="720"/>
+        <w:numPr>
+          <w:ilvl w:val="0"/>
+          <w:numId w:val="2"/>
+        </w:numPr>
+        <w:pBdr>
+          <w:top w:val="nil"/>
+          <w:left w:val="nil"/>
+          <w:bottom w:val="nil"/>
+          <w:right w:val="nil"/>
+          <w:between w:val="nil"/>
+        </w:pBdr>
+        <w:tabs>
+          <w:tab w:val="left" w:pos="1440"/>
+        </w:tabs>
+        <w:spacing w:after="0" w:line="360" w:lineRule="auto"/>
+        <w:ind w:left="425" w:right="45" w:hanging="357"/>
         <w:jc w:val="both"/>
         <w:rPr>
           <w:rFonts w:ascii="Arial" w:eastAsia="Arial" w:hAnsi="Arial" w:cs="Arial"/>
-          <w:sz w:val="24"/>
-          <w:szCs w:val="24"/>
-        </w:rPr>
-      </w:pPr>
+        </w:rPr>
+      </w:pPr>
+      <w:r>
+        <w:rPr>
+          <w:rFonts w:ascii="Arial" w:eastAsia="Arial" w:hAnsi="Arial" w:cs="Arial"/>
+          <w:sz w:val="24"/>
+          <w:szCs w:val="24"/>
+        </w:rPr>
+        <w:lastRenderedPageBreak/>
+        <w:t xml:space="preserve">Adapun alasan dan pertimbangan pengalihan status penggunaan barang milik daerah tersebut adalah </w:t>
+      </w:r>
+      <w:r>
+        <w:rPr>
+          <w:rFonts w:ascii="Arial" w:eastAsia="Arial" w:hAnsi="Arial" w:cs="Arial"/>
+          <w:sz w:val="24"/>
+          <w:szCs w:val="24"/>
+          <w:highlight w:val="yellow"/>
+        </w:rPr>
+        <w:t>{</w:t>
+      </w:r>
+      <w:r>
+        <w:rPr>
+          <w:rFonts w:ascii="Arial" w:eastAsia="Arial" w:hAnsi="Arial" w:cs="Arial"/>
+          <w:sz w:val="24"/>
+          <w:szCs w:val="24"/>
+          <w:highlight w:val="yellow"/>
+        </w:rPr>
+        <w:t>permohonan-</w:t>
+      </w:r>
+      <w:r>
+        <w:rPr>
+          <w:rFonts w:ascii="Arial" w:eastAsia="Arial" w:hAnsi="Arial" w:cs="Arial"/>
+          <w:sz w:val="24"/>
+          <w:szCs w:val="24"/>
+          <w:highlight w:val="yellow"/>
+        </w:rPr>
+        <w:t xml:space="preserve">alasan </w:t>
+      </w:r>
+      <w:r>
+        <w:rPr>
+          <w:rFonts w:ascii="Arial" w:eastAsia="Arial" w:hAnsi="Arial" w:cs="Arial"/>
+          <w:sz w:val="24"/>
+          <w:szCs w:val="24"/>
+          <w:highlight w:val="yellow"/>
+        </w:rPr>
+        <w:t>}</w:t>
+      </w:r>
+      <w:r>
+        <w:rPr>
+          <w:rFonts w:ascii="Arial" w:eastAsia="Arial" w:hAnsi="Arial" w:cs="Arial"/>
+          <w:sz w:val="24"/>
+          <w:szCs w:val="24"/>
+        </w:rPr>
+        <w:t>.</w:t>
+      </w:r>
     </w:p>
     <w:p>
       <w:pPr>
         <w:numPr>
           <w:ilvl w:val="0"/>
-          <w:numId w:val="1"/>
+          <w:numId w:val="2"/>
         </w:numPr>
-        <w:spacing w:before="240" w:after="0" w:line="360" w:lineRule="auto"/>
+        <w:pBdr>
+          <w:top w:val="nil"/>
+          <w:left w:val="nil"/>
+          <w:bottom w:val="nil"/>
+          <w:right w:val="nil"/>
+          <w:between w:val="nil"/>
+        </w:pBdr>
+        <w:tabs>
+          <w:tab w:val="left" w:pos="1440"/>
+        </w:tabs>
+        <w:spacing w:after="0" w:line="360" w:lineRule="auto"/>
+        <w:ind w:left="425" w:right="45" w:hanging="357"/>
         <w:jc w:val="both"/>
         <w:rPr>
           <w:rFonts w:ascii="Arial" w:eastAsia="Arial" w:hAnsi="Arial" w:cs="Arial"/>
-          <w:sz w:val="24"/>
-          <w:szCs w:val="24"/>
-        </w:rPr>
-      </w:pPr>
-      <w:r>
-        <w:rPr>
-          <w:rFonts w:ascii="Arial" w:eastAsia="Arial" w:hAnsi="Arial" w:cs="Arial"/>
-          <w:sz w:val="24"/>
-          <w:szCs w:val="24"/>
-        </w:rPr>
-        <w:lastRenderedPageBreak/>
-        <w:t>Adapun alasan dan pertimbangan pengalihan status penggunaan barang milik daerah tersebut adalah untuk mendukung efektivitas, efisiensi, dan optimalisasi penggunaan barang milik daerah sesuai kebutuhan Perangkat Daerah penerima.</w:t>
+        </w:rPr>
+      </w:pPr>
+      <w:r>
+        <w:rPr>
+          <w:rFonts w:ascii="Arial" w:eastAsia="Arial" w:hAnsi="Arial" w:cs="Arial"/>
+          <w:sz w:val="24"/>
+          <w:szCs w:val="24"/>
+        </w:rPr>
+        <w:t>Berdasarkan hasil penelitian dan pengkajian terhadap usulan yang diajukan, permohonan pengalihan status penggunaan barang milik daerah sebagaimana dimaksud dapat disetujui.</w:t>
       </w:r>
     </w:p>
     <w:p>
       <w:pPr>
+        <w:pBdr>
+          <w:top w:val="nil"/>
+          <w:left w:val="nil"/>
+          <w:bottom w:val="nil"/>
+          <w:right w:val="nil"/>
+          <w:between w:val="nil"/>
+        </w:pBdr>
+        <w:tabs>
+          <w:tab w:val="left" w:pos="1440"/>
+        </w:tabs>
+        <w:spacing w:after="0" w:line="360" w:lineRule="auto"/>
+        <w:ind w:left="425" w:right="45"/>
+        <w:jc w:val="both"/>
+        <w:rPr>
+          <w:rFonts w:ascii="Arial" w:eastAsia="Arial" w:hAnsi="Arial" w:cs="Arial"/>
+          <w:sz w:val="24"/>
+          <w:szCs w:val="24"/>
+        </w:rPr>
+      </w:pPr>
+      <w:r>
+        <w:rPr>
+          <w:rFonts w:ascii="Arial" w:eastAsia="Arial" w:hAnsi="Arial" w:cs="Arial"/>
+          <w:sz w:val="24"/>
+          <w:szCs w:val="24"/>
+          <w:highlight w:val="green"/>
+        </w:rPr>
+        <w:t>{/</w:t>
+      </w:r>
+      <w:r>
+        <w:rPr>
+          <w:rFonts w:ascii="Arial" w:eastAsia="Arial" w:hAnsi="Arial" w:cs="Arial"/>
+          <w:sz w:val="24"/>
+          <w:szCs w:val="24"/>
+          <w:highlight w:val="green"/>
+        </w:rPr>
+        <w:t>ba-penelitian</w:t>
+      </w:r>
+      <w:r>
+        <w:rPr>
+          <w:rFonts w:ascii="Arial" w:eastAsia="Arial" w:hAnsi="Arial" w:cs="Arial"/>
+          <w:sz w:val="24"/>
+          <w:szCs w:val="24"/>
+          <w:highlight w:val="green"/>
+        </w:rPr>
+        <w:t>-tunggal</w:t>
+      </w:r>
+      <w:r>
+        <w:rPr>
+          <w:rFonts w:ascii="Arial" w:eastAsia="Arial" w:hAnsi="Arial" w:cs="Arial"/>
+          <w:sz w:val="24"/>
+          <w:szCs w:val="24"/>
+          <w:highlight w:val="green"/>
+        </w:rPr>
+        <w:t>}</w:t>
+      </w:r>
+      <w:r>
+        <w:rPr>
+          <w:rFonts w:ascii="Arial" w:eastAsia="Arial" w:hAnsi="Arial" w:cs="Arial"/>
+          <w:sz w:val="24"/>
+          <w:szCs w:val="24"/>
+        </w:rPr>
+        <w:t>.</w:t>
+      </w:r>
+    </w:p>
+    <w:p>
+      <w:pPr>
+        <w:pBdr>
+          <w:top w:val="nil"/>
+          <w:left w:val="nil"/>
+          <w:bottom w:val="nil"/>
+          <w:right w:val="nil"/>
+          <w:between w:val="nil"/>
+        </w:pBdr>
+        <w:tabs>
+          <w:tab w:val="left" w:pos="1440"/>
+        </w:tabs>
+        <w:spacing w:after="0" w:line="360" w:lineRule="auto"/>
+        <w:ind w:left="425" w:right="45"/>
+        <w:jc w:val="both"/>
+        <w:rPr>
+          <w:rFonts w:ascii="Arial" w:eastAsia="Arial" w:hAnsi="Arial" w:cs="Arial"/>
+          <w:sz w:val="24"/>
+          <w:szCs w:val="24"/>
+        </w:rPr>
+      </w:pPr>
+      <w:r>
+        <w:rPr>
+          <w:rFonts w:ascii="Arial" w:eastAsia="Arial" w:hAnsi="Arial" w:cs="Arial"/>
+          <w:sz w:val="24"/>
+          <w:szCs w:val="24"/>
+        </w:rPr>
+        <w:t>{#</w:t>
+      </w:r>
+      <w:r>
+        <w:rPr>
+          <w:rFonts w:ascii="Arial" w:eastAsia="Arial" w:hAnsi="Arial" w:cs="Arial"/>
+          <w:sz w:val="24"/>
+          <w:szCs w:val="24"/>
+          <w:highlight w:val="green"/>
+        </w:rPr>
+        <w:t>ba-penelitian</w:t>
+      </w:r>
+      <w:r>
+        <w:rPr>
+          <w:rFonts w:ascii="Arial" w:eastAsia="Arial" w:hAnsi="Arial" w:cs="Arial"/>
+          <w:sz w:val="24"/>
+          <w:szCs w:val="24"/>
+          <w:highlight w:val="green"/>
+        </w:rPr>
+        <w:t>-</w:t>
+      </w:r>
+      <w:r>
+        <w:rPr>
+          <w:rFonts w:ascii="Arial" w:eastAsia="Arial" w:hAnsi="Arial" w:cs="Arial"/>
+          <w:sz w:val="24"/>
+          <w:szCs w:val="24"/>
+        </w:rPr>
+        <w:t>jamak</w:t>
+      </w:r>
+      <w:r>
+        <w:rPr>
+          <w:rFonts w:ascii="Arial" w:eastAsia="Arial" w:hAnsi="Arial" w:cs="Arial"/>
+          <w:sz w:val="24"/>
+          <w:szCs w:val="24"/>
+        </w:rPr>
+        <w:t>}</w:t>
+      </w:r>
+    </w:p>
+    <w:p>
+      <w:pPr>
+        <w:keepNext/>
         <w:numPr>
           <w:ilvl w:val="0"/>
-          <w:numId w:val="1"/>
+          <w:numId w:val="3"/>
         </w:numPr>
-        <w:spacing w:after="240" w:line="360" w:lineRule="auto"/>
+        <w:pBdr>
+          <w:top w:val="nil"/>
+          <w:left w:val="nil"/>
+          <w:bottom w:val="nil"/>
+          <w:right w:val="nil"/>
+          <w:between w:val="nil"/>
+        </w:pBdr>
+        <w:tabs>
+          <w:tab w:val="left" w:pos="1440"/>
+        </w:tabs>
+        <w:spacing w:after="0" w:line="360" w:lineRule="auto"/>
+        <w:ind w:left="425" w:right="45" w:hanging="357"/>
         <w:jc w:val="both"/>
         <w:rPr>
           <w:rFonts w:ascii="Arial" w:eastAsia="Arial" w:hAnsi="Arial" w:cs="Arial"/>
-          <w:sz w:val="24"/>
-          <w:szCs w:val="24"/>
-        </w:rPr>
-      </w:pPr>
-      <w:r>
-        <w:rPr>
-          <w:rFonts w:ascii="Arial" w:eastAsia="Arial" w:hAnsi="Arial" w:cs="Arial"/>
-          <w:sz w:val="24"/>
-          <w:szCs w:val="24"/>
-        </w:rPr>
-        <w:t>Berdasarkan hasil penelitian dan pengkajian terhadap usulan yang diajukan, permohonan pengalihan status penggunaan barang milik daerah sebagaimana dimaksud dapat disetujui.</w:t>
+          <w:color w:val="000000"/>
+          <w:sz w:val="24"/>
+          <w:szCs w:val="24"/>
+        </w:rPr>
+      </w:pPr>
+      <w:r>
+        <w:rPr>
+          <w:rFonts w:ascii="Arial" w:eastAsia="Arial" w:hAnsi="Arial" w:cs="Arial"/>
+          <w:sz w:val="24"/>
+          <w:szCs w:val="24"/>
+        </w:rPr>
+        <w:t xml:space="preserve">Permohonan pengalihan status penggunaan barang milik daerah yang diajukan oleh </w:t>
+      </w:r>
+      <w:r>
+        <w:rPr>
+          <w:rFonts w:ascii="Arial" w:eastAsia="Arial" w:hAnsi="Arial" w:cs="Arial"/>
+          <w:sz w:val="24"/>
+          <w:szCs w:val="24"/>
+          <w:highlight w:val="yellow"/>
+        </w:rPr>
+        <w:t>{perangkat-daerah-asal}</w:t>
+      </w:r>
+      <w:r>
+        <w:rPr>
+          <w:rFonts w:ascii="Arial" w:eastAsia="Arial" w:hAnsi="Arial" w:cs="Arial"/>
+          <w:sz w:val="24"/>
+          <w:szCs w:val="24"/>
+        </w:rPr>
+        <w:t xml:space="preserve"> sebagaimana tercantum dalam lampiran telah sesuai dengan ketentuan peraturan perundang-undangan yang berlaku.</w:t>
       </w:r>
     </w:p>
     <w:p>
       <w:pPr>
+        <w:keepNext/>
+        <w:numPr>
+          <w:ilvl w:val="0"/>
+          <w:numId w:val="3"/>
+        </w:numPr>
+        <w:pBdr>
+          <w:top w:val="nil"/>
+          <w:left w:val="nil"/>
+          <w:bottom w:val="nil"/>
+          <w:right w:val="nil"/>
+          <w:between w:val="nil"/>
+        </w:pBdr>
+        <w:tabs>
+          <w:tab w:val="left" w:pos="1440"/>
+        </w:tabs>
+        <w:spacing w:after="0" w:line="360" w:lineRule="auto"/>
+        <w:ind w:left="425" w:right="45" w:hanging="357"/>
+        <w:jc w:val="both"/>
+        <w:rPr>
+          <w:rFonts w:ascii="Arial" w:eastAsia="Arial" w:hAnsi="Arial" w:cs="Arial"/>
+          <w:color w:val="000000"/>
+          <w:sz w:val="24"/>
+          <w:szCs w:val="24"/>
+        </w:rPr>
+      </w:pPr>
+      <w:r>
+        <w:rPr>
+          <w:rFonts w:ascii="Arial" w:eastAsia="Arial" w:hAnsi="Arial" w:cs="Arial"/>
+          <w:color w:val="000000"/>
+          <w:sz w:val="24"/>
+          <w:szCs w:val="24"/>
+        </w:rPr>
+        <w:t xml:space="preserve">Permohonan tersebut telah diteliti oleh Tim Penelitian Penggunaan Barang Milik Daerah </w:t>
+      </w:r>
+      <w:r>
+        <w:rPr>
+          <w:rFonts w:ascii="Arial" w:eastAsia="Arial" w:hAnsi="Arial" w:cs="Arial"/>
+          <w:color w:val="000000"/>
+          <w:sz w:val="24"/>
+          <w:szCs w:val="24"/>
+        </w:rPr>
+        <w:t xml:space="preserve">sebagaimana </w:t>
+      </w:r>
+      <w:r>
+        <w:rPr>
+          <w:rFonts w:ascii="Arial" w:eastAsia="Arial" w:hAnsi="Arial" w:cs="Arial"/>
+          <w:color w:val="000000"/>
+          <w:sz w:val="24"/>
+          <w:szCs w:val="24"/>
+        </w:rPr>
+        <w:t>berita acara penelitian dengan rincian</w:t>
+      </w:r>
+      <w:r>
+        <w:rPr>
+          <w:rFonts w:ascii="Arial" w:eastAsia="Arial" w:hAnsi="Arial" w:cs="Arial"/>
+          <w:color w:val="000000"/>
+          <w:sz w:val="24"/>
+          <w:szCs w:val="24"/>
+        </w:rPr>
+        <w:t>:{#</w:t>
+      </w:r>
+      <w:r>
+        <w:rPr>
+          <w:rFonts w:ascii="Arial" w:eastAsia="Arial" w:hAnsi="Arial" w:cs="Arial"/>
+          <w:color w:val="000000"/>
+          <w:sz w:val="24"/>
+          <w:szCs w:val="24"/>
+        </w:rPr>
+        <w:t>ba-penelitian</w:t>
+      </w:r>
+      <w:r>
+        <w:rPr>
+          <w:rFonts w:ascii="Arial" w:eastAsia="Arial" w:hAnsi="Arial" w:cs="Arial"/>
+          <w:color w:val="000000"/>
+          <w:sz w:val="24"/>
+          <w:szCs w:val="24"/>
+        </w:rPr>
+        <w:t>}</w:t>
+      </w:r>
+    </w:p>
+    <w:p>
+      <w:pPr>
+        <w:numPr>
+          <w:ilvl w:val="1"/>
+          <w:numId w:val="3"/>
+        </w:numPr>
+        <w:pBdr>
+          <w:top w:val="nil"/>
+          <w:left w:val="nil"/>
+          <w:bottom w:val="nil"/>
+          <w:right w:val="nil"/>
+          <w:between w:val="nil"/>
+        </w:pBdr>
+        <w:tabs>
+          <w:tab w:val="left" w:pos="1440"/>
+        </w:tabs>
+        <w:spacing w:after="0" w:line="360" w:lineRule="auto"/>
+        <w:ind w:right="46"/>
+        <w:jc w:val="both"/>
+        <w:rPr>
+          <w:rFonts w:ascii="Arial" w:eastAsia="Arial" w:hAnsi="Arial" w:cs="Arial"/>
+          <w:color w:val="000000"/>
+          <w:sz w:val="24"/>
+          <w:szCs w:val="24"/>
+        </w:rPr>
+      </w:pPr>
+      <w:r>
+        <w:rPr>
+          <w:rFonts w:ascii="Arial" w:eastAsia="Arial" w:hAnsi="Arial" w:cs="Arial"/>
+          <w:color w:val="000000"/>
+          <w:sz w:val="24"/>
+          <w:szCs w:val="24"/>
+        </w:rPr>
+        <w:t xml:space="preserve">Nomor </w:t>
+      </w:r>
+      <w:r>
+        <w:rPr>
+          <w:rFonts w:ascii="Arial" w:eastAsia="Arial" w:hAnsi="Arial" w:cs="Arial"/>
+          <w:sz w:val="24"/>
+          <w:szCs w:val="24"/>
+          <w:highlight w:val="yellow"/>
+        </w:rPr>
+        <w:t>{suratNomor}</w:t>
+      </w:r>
+      <w:r>
+        <w:rPr>
+          <w:rFonts w:ascii="Arial" w:eastAsia="Arial" w:hAnsi="Arial" w:cs="Arial"/>
+          <w:color w:val="000000"/>
+          <w:sz w:val="24"/>
+          <w:szCs w:val="24"/>
+        </w:rPr>
+        <w:t xml:space="preserve"> tanggal </w:t>
+      </w:r>
+      <w:r>
+        <w:rPr>
+          <w:rFonts w:ascii="Arial" w:eastAsia="Arial" w:hAnsi="Arial" w:cs="Arial"/>
+          <w:sz w:val="24"/>
+          <w:szCs w:val="24"/>
+          <w:highlight w:val="yellow"/>
+        </w:rPr>
+        <w:t>{suratTanggal}</w:t>
+      </w:r>
+      <w:r>
+        <w:rPr>
+          <w:rFonts w:ascii="Arial" w:eastAsia="Arial" w:hAnsi="Arial" w:cs="Arial"/>
+          <w:color w:val="000000"/>
+          <w:sz w:val="24"/>
+          <w:szCs w:val="24"/>
+        </w:rPr>
+        <w:t>.{/</w:t>
+      </w:r>
+      <w:r>
+        <w:rPr>
+          <w:rFonts w:ascii="Arial" w:eastAsia="Arial" w:hAnsi="Arial" w:cs="Arial"/>
+          <w:color w:val="000000"/>
+          <w:sz w:val="24"/>
+          <w:szCs w:val="24"/>
+        </w:rPr>
+        <w:t>ba-penelitian</w:t>
+      </w:r>
+      <w:r>
+        <w:rPr>
+          <w:rFonts w:ascii="Arial" w:eastAsia="Arial" w:hAnsi="Arial" w:cs="Arial"/>
+          <w:color w:val="000000"/>
+          <w:sz w:val="24"/>
+          <w:szCs w:val="24"/>
+        </w:rPr>
+        <w:t>}</w:t>
+      </w:r>
+    </w:p>
+    <w:p>
+      <w:pPr>
+        <w:numPr>
+          <w:ilvl w:val="0"/>
+          <w:numId w:val="3"/>
+        </w:numPr>
+        <w:pBdr>
+          <w:top w:val="nil"/>
+          <w:left w:val="nil"/>
+          <w:bottom w:val="nil"/>
+          <w:right w:val="nil"/>
+          <w:between w:val="nil"/>
+        </w:pBdr>
+        <w:tabs>
+          <w:tab w:val="left" w:pos="1440"/>
+        </w:tabs>
+        <w:spacing w:after="0" w:line="360" w:lineRule="auto"/>
+        <w:ind w:left="425" w:right="45" w:hanging="357"/>
+        <w:jc w:val="both"/>
+        <w:rPr>
+          <w:rFonts w:ascii="Arial" w:eastAsia="Arial" w:hAnsi="Arial" w:cs="Arial"/>
+        </w:rPr>
+      </w:pPr>
+      <w:r>
+        <w:rPr>
+          <w:rFonts w:ascii="Arial" w:eastAsia="Arial" w:hAnsi="Arial" w:cs="Arial"/>
+          <w:sz w:val="24"/>
+          <w:szCs w:val="24"/>
+        </w:rPr>
+        <w:t xml:space="preserve">Barang Milik Daerah sebagaimana dimaksud dalam poin 1 </w:t>
+      </w:r>
+      <w:r>
+        <w:rPr>
+          <w:rFonts w:ascii="Arial" w:eastAsia="Arial" w:hAnsi="Arial" w:cs="Arial"/>
+          <w:color w:val="000000"/>
+          <w:sz w:val="24"/>
+          <w:szCs w:val="24"/>
+        </w:rPr>
+        <w:t xml:space="preserve">merupakan barang milik </w:t>
+      </w:r>
+      <w:r>
+        <w:rPr>
+          <w:rFonts w:ascii="Arial" w:eastAsia="Arial" w:hAnsi="Arial" w:cs="Arial"/>
+          <w:sz w:val="24"/>
+          <w:szCs w:val="24"/>
+        </w:rPr>
+        <w:t>daerah</w:t>
+      </w:r>
+      <w:r>
+        <w:rPr>
+          <w:rFonts w:ascii="Arial" w:eastAsia="Arial" w:hAnsi="Arial" w:cs="Arial"/>
+          <w:color w:val="000000"/>
+          <w:sz w:val="24"/>
+          <w:szCs w:val="24"/>
+        </w:rPr>
+        <w:t xml:space="preserve"> yang tercatat di </w:t>
+      </w:r>
+      <w:r>
+        <w:rPr>
+          <w:rFonts w:ascii="Arial" w:eastAsia="Arial" w:hAnsi="Arial" w:cs="Arial"/>
+          <w:sz w:val="24"/>
+          <w:szCs w:val="24"/>
+        </w:rPr>
+        <w:t xml:space="preserve">aplikasi E-BMD </w:t>
+      </w:r>
+      <w:r>
+        <w:rPr>
+          <w:rFonts w:ascii="Arial" w:eastAsia="Arial" w:hAnsi="Arial" w:cs="Arial"/>
+          <w:sz w:val="24"/>
+          <w:szCs w:val="24"/>
+          <w:highlight w:val="yellow"/>
+        </w:rPr>
+        <w:t>{perangkat-daerah-asal}</w:t>
+      </w:r>
+      <w:r>
+        <w:rPr>
+          <w:rFonts w:ascii="Arial" w:eastAsia="Arial" w:hAnsi="Arial" w:cs="Arial"/>
+          <w:color w:val="000000"/>
+          <w:sz w:val="24"/>
+          <w:szCs w:val="24"/>
+        </w:rPr>
+        <w:t xml:space="preserve"> dengan nilai perolehan sebesar </w:t>
+      </w:r>
+      <w:r>
+        <w:rPr>
+          <w:rFonts w:ascii="Arial" w:eastAsia="Arial" w:hAnsi="Arial" w:cs="Arial"/>
+          <w:sz w:val="24"/>
+          <w:szCs w:val="24"/>
+          <w:highlight w:val="yellow"/>
+        </w:rPr>
+        <w:t>{total-perolehan}</w:t>
+      </w:r>
+      <w:r>
+        <w:rPr>
+          <w:rFonts w:ascii="Arial" w:eastAsia="Arial" w:hAnsi="Arial" w:cs="Arial"/>
+          <w:sz w:val="24"/>
+          <w:szCs w:val="24"/>
+          <w:highlight w:val="yellow"/>
+        </w:rPr>
+        <w:t xml:space="preserve"> </w:t>
+      </w:r>
+      <w:r>
+        <w:rPr>
+          <w:rFonts w:ascii="Arial" w:eastAsia="Arial" w:hAnsi="Arial" w:cs="Arial"/>
+          <w:sz w:val="24"/>
+          <w:szCs w:val="24"/>
+        </w:rPr>
+        <w:t>dengan rincian sebagaimana terlampir</w:t>
+      </w:r>
+      <w:r>
+        <w:rPr>
+          <w:rFonts w:ascii="Arial" w:eastAsia="Arial" w:hAnsi="Arial" w:cs="Arial"/>
+          <w:color w:val="000000"/>
+          <w:sz w:val="24"/>
+          <w:szCs w:val="24"/>
+        </w:rPr>
+        <w:t>.</w:t>
+      </w:r>
+    </w:p>
+    <w:p>
+      <w:pPr>
+        <w:numPr>
+          <w:ilvl w:val="0"/>
+          <w:numId w:val="3"/>
+        </w:numPr>
+        <w:pBdr>
+          <w:top w:val="nil"/>
+          <w:left w:val="nil"/>
+          <w:bottom w:val="nil"/>
+          <w:right w:val="nil"/>
+          <w:between w:val="nil"/>
+        </w:pBdr>
+        <w:tabs>
+          <w:tab w:val="left" w:pos="1440"/>
+        </w:tabs>
+        <w:spacing w:after="0" w:line="360" w:lineRule="auto"/>
+        <w:ind w:left="425" w:right="45" w:hanging="357"/>
+        <w:jc w:val="both"/>
+        <w:rPr>
+          <w:rFonts w:ascii="Arial" w:eastAsia="Arial" w:hAnsi="Arial" w:cs="Arial"/>
+        </w:rPr>
+      </w:pPr>
+      <w:r>
+        <w:rPr>
+          <w:rFonts w:ascii="Arial" w:eastAsia="Arial" w:hAnsi="Arial" w:cs="Arial"/>
+          <w:sz w:val="24"/>
+          <w:szCs w:val="24"/>
+        </w:rPr>
+        <w:t xml:space="preserve">Barang milik daerah tersebut akan dialih status kepada </w:t>
+      </w:r>
+      <w:r>
+        <w:rPr>
+          <w:rFonts w:ascii="Arial" w:eastAsia="Arial" w:hAnsi="Arial" w:cs="Arial"/>
+          <w:sz w:val="24"/>
+          <w:szCs w:val="24"/>
+          <w:highlight w:val="yellow"/>
+        </w:rPr>
+        <w:t>{perangkat-daerah-tujuan</w:t>
+      </w:r>
+      <w:r>
+        <w:rPr>
+          <w:rFonts w:ascii="Arial" w:eastAsia="Arial" w:hAnsi="Arial" w:cs="Arial"/>
+          <w:sz w:val="24"/>
+          <w:szCs w:val="24"/>
+        </w:rPr>
+        <w:t>}</w:t>
+      </w:r>
+      <w:r>
+        <w:rPr>
+          <w:rFonts w:ascii="Arial" w:eastAsia="Arial" w:hAnsi="Arial" w:cs="Arial"/>
+          <w:sz w:val="24"/>
+          <w:szCs w:val="24"/>
+        </w:rPr>
+        <w:t>.</w:t>
+      </w:r>
+    </w:p>
+    <w:p>
+      <w:pPr>
+        <w:numPr>
+          <w:ilvl w:val="0"/>
+          <w:numId w:val="3"/>
+        </w:numPr>
+        <w:pBdr>
+          <w:top w:val="nil"/>
+          <w:left w:val="nil"/>
+          <w:bottom w:val="nil"/>
+          <w:right w:val="nil"/>
+          <w:between w:val="nil"/>
+        </w:pBdr>
+        <w:tabs>
+          <w:tab w:val="left" w:pos="1440"/>
+        </w:tabs>
+        <w:spacing w:after="0" w:line="360" w:lineRule="auto"/>
+        <w:ind w:left="425" w:right="45" w:hanging="357"/>
+        <w:jc w:val="both"/>
+        <w:rPr>
+          <w:rFonts w:ascii="Arial" w:eastAsia="Arial" w:hAnsi="Arial" w:cs="Arial"/>
+        </w:rPr>
+      </w:pPr>
+      <w:r>
+        <w:rPr>
+          <w:rFonts w:ascii="Arial" w:eastAsia="Arial" w:hAnsi="Arial" w:cs="Arial"/>
+          <w:sz w:val="24"/>
+          <w:szCs w:val="24"/>
+        </w:rPr>
+        <w:t xml:space="preserve">Adapun alasan dan pertimbangan pengalihan status penggunaan barang milik daerah tersebut adalah </w:t>
+      </w:r>
+      <w:r>
+        <w:rPr>
+          <w:rFonts w:ascii="Arial" w:eastAsia="Arial" w:hAnsi="Arial" w:cs="Arial"/>
+          <w:sz w:val="24"/>
+          <w:szCs w:val="24"/>
+          <w:highlight w:val="yellow"/>
+        </w:rPr>
+        <w:t>{</w:t>
+      </w:r>
+      <w:r>
+        <w:rPr>
+          <w:rFonts w:ascii="Arial" w:eastAsia="Arial" w:hAnsi="Arial" w:cs="Arial"/>
+          <w:sz w:val="24"/>
+          <w:szCs w:val="24"/>
+          <w:highlight w:val="yellow"/>
+        </w:rPr>
+        <w:t>permohonan-</w:t>
+      </w:r>
+      <w:r>
+        <w:rPr>
+          <w:rFonts w:ascii="Arial" w:eastAsia="Arial" w:hAnsi="Arial" w:cs="Arial"/>
+          <w:sz w:val="24"/>
+          <w:szCs w:val="24"/>
+          <w:highlight w:val="yellow"/>
+        </w:rPr>
+        <w:t>alasan}</w:t>
+      </w:r>
+      <w:r>
+        <w:rPr>
+          <w:rFonts w:ascii="Arial" w:eastAsia="Arial" w:hAnsi="Arial" w:cs="Arial"/>
+          <w:sz w:val="24"/>
+          <w:szCs w:val="24"/>
+        </w:rPr>
+        <w:t>.</w:t>
+      </w:r>
+    </w:p>
+    <w:p>
+      <w:pPr>
+        <w:numPr>
+          <w:ilvl w:val="0"/>
+          <w:numId w:val="3"/>
+        </w:numPr>
+        <w:pBdr>
+          <w:top w:val="nil"/>
+          <w:left w:val="nil"/>
+          <w:bottom w:val="nil"/>
+          <w:right w:val="nil"/>
+          <w:between w:val="nil"/>
+        </w:pBdr>
+        <w:tabs>
+          <w:tab w:val="left" w:pos="1440"/>
+        </w:tabs>
+        <w:spacing w:after="0" w:line="360" w:lineRule="auto"/>
+        <w:ind w:left="425" w:right="45" w:hanging="357"/>
+        <w:jc w:val="both"/>
+        <w:rPr>
+          <w:rFonts w:ascii="Arial" w:eastAsia="Arial" w:hAnsi="Arial" w:cs="Arial"/>
+        </w:rPr>
+      </w:pPr>
+      <w:r>
+        <w:rPr>
+          <w:rFonts w:ascii="Arial" w:eastAsia="Arial" w:hAnsi="Arial" w:cs="Arial"/>
+          <w:sz w:val="24"/>
+          <w:szCs w:val="24"/>
+        </w:rPr>
+        <w:t>Berdasarkan hasil penelitian dan pengkajian terhadap usulan yang diajukan, permohonan pengalihan status penggunaan barang milik daerah sebagaimana dimaksud dapat disetujui.</w:t>
+      </w:r>
+    </w:p>
+    <w:p>
+      <w:pPr>
+        <w:spacing w:after="240" w:line="360" w:lineRule="auto"/>
+        <w:ind w:firstLine="720"/>
+        <w:jc w:val="both"/>
+        <w:rPr>
+          <w:rFonts w:ascii="Arial" w:eastAsia="Arial" w:hAnsi="Arial" w:cs="Arial"/>
+          <w:sz w:val="24"/>
+          <w:szCs w:val="24"/>
+        </w:rPr>
+      </w:pPr>
+      <w:r>
+        <w:rPr>
+          <w:rFonts w:ascii="Arial" w:eastAsia="Arial" w:hAnsi="Arial" w:cs="Arial"/>
+          <w:sz w:val="24"/>
+          <w:szCs w:val="24"/>
+        </w:rPr>
+        <w:t>{/</w:t>
+      </w:r>
+      <w:r>
+        <w:rPr>
+          <w:rFonts w:ascii="Arial" w:eastAsia="Arial" w:hAnsi="Arial" w:cs="Arial"/>
+          <w:sz w:val="24"/>
+          <w:szCs w:val="24"/>
+          <w:highlight w:val="green"/>
+        </w:rPr>
+        <w:t>ba-penelitian</w:t>
+      </w:r>
+      <w:r>
+        <w:rPr>
+          <w:rFonts w:ascii="Arial" w:eastAsia="Arial" w:hAnsi="Arial" w:cs="Arial"/>
+          <w:sz w:val="24"/>
+          <w:szCs w:val="24"/>
+          <w:highlight w:val="green"/>
+        </w:rPr>
+        <w:t>-</w:t>
+      </w:r>
+      <w:r>
+        <w:rPr>
+          <w:rFonts w:ascii="Arial" w:eastAsia="Arial" w:hAnsi="Arial" w:cs="Arial"/>
+          <w:sz w:val="24"/>
+          <w:szCs w:val="24"/>
+        </w:rPr>
+        <w:t>jamak</w:t>
+      </w:r>
+      <w:r>
+        <w:rPr>
+          <w:rFonts w:ascii="Arial" w:eastAsia="Arial" w:hAnsi="Arial" w:cs="Arial"/>
+          <w:sz w:val="24"/>
+          <w:szCs w:val="24"/>
+        </w:rPr>
+        <w:t>}</w:t>
+      </w:r>
+    </w:p>
+    <w:p>
+      <w:pPr>
         <w:spacing w:before="240" w:after="240" w:line="360" w:lineRule="auto"/>
+        <w:ind w:firstLine="720"/>
         <w:jc w:val="both"/>
         <w:rPr>
           <w:rFonts w:ascii="Arial" w:eastAsia="Arial" w:hAnsi="Arial" w:cs="Arial"/>
@@ -1092,7 +2144,23 @@
                 <w:sz w:val="24"/>
                 <w:szCs w:val="24"/>
               </w:rPr>
-              <w:t>${s.qr_tanda_tangan}</w:t>
+              <w:t>{</w:t>
+            </w:r>
+            <w:r>
+              <w:rPr>
+                <w:rFonts w:ascii="Arial" w:eastAsia="Arial" w:hAnsi="Arial" w:cs="Arial"/>
+                <w:sz w:val="24"/>
+                <w:szCs w:val="24"/>
+              </w:rPr>
+              <w:t>nodin-</w:t>
+            </w:r>
+            <w:r>
+              <w:rPr>
+                <w:rFonts w:ascii="Arial" w:eastAsia="Arial" w:hAnsi="Arial" w:cs="Arial"/>
+                <w:sz w:val="24"/>
+                <w:szCs w:val="24"/>
+              </w:rPr>
+              <w:t>qr}</w:t>
             </w:r>
           </w:p>
         </w:tc>
@@ -1136,8 +2204,8 @@
           <w:szCs w:val="24"/>
         </w:rPr>
         <w:sectPr>
-          <w:footerReference w:type="default" r:id="rId8"/>
-          <w:footerReference w:type="first" r:id="rId9"/>
+          <w:footerReference w:type="default" r:id="rId9"/>
+          <w:footerReference w:type="first" r:id="rId10"/>
           <w:pgSz w:w="11906" w:h="16838"/>
           <w:pgMar w:top="561" w:right="1137" w:bottom="1411" w:left="1699" w:header="0" w:footer="0" w:gutter="0"/>
           <w:pgNumType w:start="1"/>
@@ -1195,6 +2263,24 @@
           <w:highlight w:val="yellow"/>
         </w:rPr>
         <w:t>-nomor}</w:t>
+      </w:r>
+      <w:r>
+        <w:rPr>
+          <w:rFonts w:ascii="Arial" w:eastAsia="Arial" w:hAnsi="Arial" w:cs="Arial"/>
+          <w:sz w:val="24"/>
+          <w:szCs w:val="24"/>
+        </w:rPr>
+        <w:br/>
+        <w:t xml:space="preserve">TANGGAL </w:t>
+      </w:r>
+      <w:r>
+        <w:rPr>
+          <w:rFonts w:ascii="Arial" w:eastAsia="Arial" w:hAnsi="Arial" w:cs="Arial"/>
+          <w:sz w:val="24"/>
+          <w:szCs w:val="24"/>
+          <w:highlight w:val="yellow"/>
+        </w:rPr>
+        <w:t>{nodin-tanggal}</w:t>
       </w:r>
     </w:p>
     <w:p>
@@ -2915,61 +4001,9 @@
 <w:ftr xmlns:wpc="http://schemas.microsoft.com/office/word/2010/wordprocessingCanvas" xmlns:cx="http://schemas.microsoft.com/office/drawing/2014/chartex" xmlns:cx1="http://schemas.microsoft.com/office/drawing/2015/9/8/chartex" xmlns:cx2="http://schemas.microsoft.com/office/drawing/2015/10/21/chartex" xmlns:cx3="http://schemas.microsoft.com/office/drawing/2016/5/9/chartex" xmlns:cx4="http://schemas.microsoft.com/office/drawing/2016/5/10/chartex" xmlns:cx5="http://schemas.microsoft.com/office/drawing/2016/5/11/chartex" xmlns:cx6="http://schemas.microsoft.com/office/drawing/2016/5/12/chartex" xmlns:cx7="http://schemas.microsoft.com/office/drawing/2016/5/13/chartex" xmlns:cx8="http://schemas.microsoft.com/office/drawing/2016/5/14/chartex" xmlns:mc="http://schemas.openxmlformats.org/markup-compatibility/2006" xmlns:aink="http://schemas.microsoft.com/office/drawing/2016/ink" xmlns:am3d="http://schemas.microsoft.com/office/drawing/2017/model3d" xmlns:o="urn:schemas-microsoft-com:office:office" xmlns:oel="http://schemas.microsoft.com/office/2019/extlst" xmlns:r="http://schemas.openxmlformats.org/officeDocument/2006/relationships" xmlns:m="http://schemas.openxmlformats.org/officeDocument/2006/math" xmlns:v="urn:schemas-microsoft-com:vml" xmlns:wp14="http://schemas.microsoft.com/office/word/2010/wordprocessingDrawing" xmlns:wp="http://schemas.openxmlformats.org/drawingml/2006/wordprocessingDrawing" xmlns:w10="urn:schemas-microsoft-com:office:word" xmlns:w="http://schemas.openxmlformats.org/wordprocessingml/2006/main" xmlns:w14="http://schemas.microsoft.com/office/word/2010/wordml" xmlns:w15="http://schemas.microsoft.com/office/word/2012/wordml" xmlns:w16cex="http://schemas.microsoft.com/office/word/2018/wordml/cex" xmlns:w16cid="http://schemas.microsoft.com/office/word/2016/wordml/cid" xmlns:w16="http://schemas.microsoft.com/office/word/2018/wordml" xmlns:w16du="http://schemas.microsoft.com/office/word/2023/wordml/word16du" xmlns:w16sdtdh="http://schemas.microsoft.com/office/word/2020/wordml/sdtdatahash" xmlns:w16sdtfl="http://schemas.microsoft.com/office/word/2024/wordml/sdtformatlock" xmlns:w16se="http://schemas.microsoft.com/office/word/2015/wordml/symex" xmlns:wpg="http://schemas.microsoft.com/office/word/2010/wordprocessingGroup" xmlns:wpi="http://schemas.microsoft.com/office/word/2010/wordprocessingInk" xmlns:wne="http://schemas.microsoft.com/office/word/2006/wordml" xmlns:wps="http://schemas.microsoft.com/office/word/2010/wordprocessingShape" mc:Ignorable="w14 w15 w16se w16cid w16 w16cex w16sdtdh w16sdtfl w16du wp14">
   <w:p>
     <w:pPr>
-      <w:spacing w:after="0" w:line="240" w:lineRule="auto"/>
-      <w:ind w:right="-814"/>
-      <w:rPr>
-        <w:sz w:val="20"/>
-        <w:szCs w:val="20"/>
-      </w:rPr>
-    </w:pPr>
-    <w:r>
-      <w:t xml:space="preserve">1.  </w:t>
-    </w:r>
-    <w:r>
-      <w:rPr>
-        <w:sz w:val="20"/>
-        <w:szCs w:val="20"/>
-      </w:rPr>
-      <w:t>UU ITE No. 11 Tahun 2008 Pasal 5 Ayat 1</w:t>
-    </w:r>
-    <w:r>
-      <w:rPr>
-        <w:sz w:val="20"/>
-        <w:szCs w:val="20"/>
-      </w:rPr>
-      <w:br/>
-      <w:t xml:space="preserve"> "Informasi Elektronik dan/atau Dokumen Elektronik dan/atau hasil cetaknya merupakan alat bukti hukum yang sah.”</w:t>
-    </w:r>
-  </w:p>
-  <w:p>
-    <w:pPr>
-      <w:spacing w:after="0" w:line="240" w:lineRule="auto"/>
-      <w:ind w:right="-814"/>
-      <w:rPr>
-        <w:sz w:val="20"/>
-        <w:szCs w:val="20"/>
-      </w:rPr>
-    </w:pPr>
-    <w:r>
-      <w:rPr>
-        <w:sz w:val="20"/>
-        <w:szCs w:val="20"/>
-      </w:rPr>
-      <w:t>2. Dokumen ini ditandatangani secara elektronik menggunakan Sertifikat Elektronik yang diterbitkan oleh BSrE.</w:t>
-    </w:r>
-  </w:p>
-  <w:p>
-    <w:pPr>
       <w:spacing w:line="240" w:lineRule="auto"/>
       <w:ind w:right="-814"/>
     </w:pPr>
-    <w:r>
-      <w:rPr>
-        <w:sz w:val="20"/>
-        <w:szCs w:val="20"/>
-      </w:rPr>
-      <w:t>3. Surat ini dapat dibuktikan keasliannya.</w:t>
-    </w:r>
   </w:p>
 </w:ftr>
 </file>
@@ -3065,6 +4099,184 @@
 <file path=word/numbering.xml><?xml version="1.0" encoding="utf-8"?>
 <w:numbering xmlns:wpc="http://schemas.microsoft.com/office/word/2010/wordprocessingCanvas" xmlns:cx="http://schemas.microsoft.com/office/drawing/2014/chartex" xmlns:cx1="http://schemas.microsoft.com/office/drawing/2015/9/8/chartex" xmlns:cx2="http://schemas.microsoft.com/office/drawing/2015/10/21/chartex" xmlns:cx3="http://schemas.microsoft.com/office/drawing/2016/5/9/chartex" xmlns:cx4="http://schemas.microsoft.com/office/drawing/2016/5/10/chartex" xmlns:cx5="http://schemas.microsoft.com/office/drawing/2016/5/11/chartex" xmlns:cx6="http://schemas.microsoft.com/office/drawing/2016/5/12/chartex" xmlns:cx7="http://schemas.microsoft.com/office/drawing/2016/5/13/chartex" xmlns:cx8="http://schemas.microsoft.com/office/drawing/2016/5/14/chartex" xmlns:mc="http://schemas.openxmlformats.org/markup-compatibility/2006" xmlns:aink="http://schemas.microsoft.com/office/drawing/2016/ink" xmlns:am3d="http://schemas.microsoft.com/office/drawing/2017/model3d" xmlns:o="urn:schemas-microsoft-com:office:office" xmlns:oel="http://schemas.microsoft.com/office/2019/extlst" xmlns:r="http://schemas.openxmlformats.org/officeDocument/2006/relationships" xmlns:m="http://schemas.openxmlformats.org/officeDocument/2006/math" xmlns:v="urn:schemas-microsoft-com:vml" xmlns:wp14="http://schemas.microsoft.com/office/word/2010/wordprocessingDrawing" xmlns:wp="http://schemas.openxmlformats.org/drawingml/2006/wordprocessingDrawing" xmlns:w10="urn:schemas-microsoft-com:office:word" xmlns:w="http://schemas.openxmlformats.org/wordprocessingml/2006/main" xmlns:w14="http://schemas.microsoft.com/office/word/2010/wordml" xmlns:w15="http://schemas.microsoft.com/office/word/2012/wordml" xmlns:w16cex="http://schemas.microsoft.com/office/word/2018/wordml/cex" xmlns:w16cid="http://schemas.microsoft.com/office/word/2016/wordml/cid" xmlns:w16="http://schemas.microsoft.com/office/word/2018/wordml" xmlns:w16du="http://schemas.microsoft.com/office/word/2023/wordml/word16du" xmlns:w16sdtdh="http://schemas.microsoft.com/office/word/2020/wordml/sdtdatahash" xmlns:w16sdtfl="http://schemas.microsoft.com/office/word/2024/wordml/sdtformatlock" xmlns:w16se="http://schemas.microsoft.com/office/word/2015/wordml/symex" xmlns:wpg="http://schemas.microsoft.com/office/word/2010/wordprocessingGroup" xmlns:wpi="http://schemas.microsoft.com/office/word/2010/wordprocessingInk" xmlns:wne="http://schemas.microsoft.com/office/word/2006/wordml" xmlns:wps="http://schemas.microsoft.com/office/word/2010/wordprocessingShape" mc:Ignorable="w14 w15 w16se w16cid w16 w16cex w16sdtdh w16sdtfl w16du wp14">
   <w:abstractNum w:abstractNumId="0" w15:restartNumberingAfterBreak="0">
+    <w:nsid w:val="0F6D0325"/>
+    <w:multiLevelType w:val="multilevel"/>
+    <w:tmpl w:val="91A87BBA"/>
+    <w:lvl w:ilvl="0">
+      <w:start w:val="1"/>
+      <w:numFmt w:val="decimal"/>
+      <w:lvlText w:val="%1."/>
+      <w:lvlJc w:val="left"/>
+      <w:pPr>
+        <w:ind w:left="928" w:hanging="360"/>
+      </w:pPr>
+      <w:rPr>
+        <w:rFonts w:ascii="Bookman Old Style" w:eastAsia="Bookman Old Style" w:hAnsi="Bookman Old Style" w:cs="Bookman Old Style"/>
+      </w:rPr>
+    </w:lvl>
+    <w:lvl w:ilvl="1">
+      <w:start w:val="1"/>
+      <w:numFmt w:val="lowerLetter"/>
+      <w:lvlText w:val="%2."/>
+      <w:lvlJc w:val="left"/>
+      <w:pPr>
+        <w:ind w:left="1648" w:hanging="360"/>
+      </w:pPr>
+    </w:lvl>
+    <w:lvl w:ilvl="2">
+      <w:start w:val="1"/>
+      <w:numFmt w:val="lowerRoman"/>
+      <w:lvlText w:val="%3."/>
+      <w:lvlJc w:val="right"/>
+      <w:pPr>
+        <w:ind w:left="2368" w:hanging="180"/>
+      </w:pPr>
+    </w:lvl>
+    <w:lvl w:ilvl="3">
+      <w:start w:val="1"/>
+      <w:numFmt w:val="decimal"/>
+      <w:lvlText w:val="%4."/>
+      <w:lvlJc w:val="left"/>
+      <w:pPr>
+        <w:ind w:left="3088" w:hanging="360"/>
+      </w:pPr>
+    </w:lvl>
+    <w:lvl w:ilvl="4">
+      <w:start w:val="1"/>
+      <w:numFmt w:val="lowerLetter"/>
+      <w:lvlText w:val="%5."/>
+      <w:lvlJc w:val="left"/>
+      <w:pPr>
+        <w:ind w:left="3808" w:hanging="360"/>
+      </w:pPr>
+    </w:lvl>
+    <w:lvl w:ilvl="5">
+      <w:start w:val="1"/>
+      <w:numFmt w:val="lowerRoman"/>
+      <w:lvlText w:val="%6."/>
+      <w:lvlJc w:val="right"/>
+      <w:pPr>
+        <w:ind w:left="4528" w:hanging="180"/>
+      </w:pPr>
+    </w:lvl>
+    <w:lvl w:ilvl="6">
+      <w:start w:val="1"/>
+      <w:numFmt w:val="decimal"/>
+      <w:lvlText w:val="%7."/>
+      <w:lvlJc w:val="left"/>
+      <w:pPr>
+        <w:ind w:left="5248" w:hanging="360"/>
+      </w:pPr>
+    </w:lvl>
+    <w:lvl w:ilvl="7">
+      <w:start w:val="1"/>
+      <w:numFmt w:val="lowerLetter"/>
+      <w:lvlText w:val="%8."/>
+      <w:lvlJc w:val="left"/>
+      <w:pPr>
+        <w:ind w:left="5968" w:hanging="360"/>
+      </w:pPr>
+    </w:lvl>
+    <w:lvl w:ilvl="8">
+      <w:start w:val="1"/>
+      <w:numFmt w:val="lowerRoman"/>
+      <w:lvlText w:val="%9."/>
+      <w:lvlJc w:val="right"/>
+      <w:pPr>
+        <w:ind w:left="6688" w:hanging="180"/>
+      </w:pPr>
+    </w:lvl>
+  </w:abstractNum>
+  <w:abstractNum w:abstractNumId="1" w15:restartNumberingAfterBreak="0">
+    <w:nsid w:val="7231019F"/>
+    <w:multiLevelType w:val="multilevel"/>
+    <w:tmpl w:val="91A87BBA"/>
+    <w:lvl w:ilvl="0">
+      <w:start w:val="1"/>
+      <w:numFmt w:val="decimal"/>
+      <w:lvlText w:val="%1."/>
+      <w:lvlJc w:val="left"/>
+      <w:pPr>
+        <w:ind w:left="928" w:hanging="360"/>
+      </w:pPr>
+      <w:rPr>
+        <w:rFonts w:ascii="Bookman Old Style" w:eastAsia="Bookman Old Style" w:hAnsi="Bookman Old Style" w:cs="Bookman Old Style"/>
+      </w:rPr>
+    </w:lvl>
+    <w:lvl w:ilvl="1">
+      <w:start w:val="1"/>
+      <w:numFmt w:val="lowerLetter"/>
+      <w:lvlText w:val="%2."/>
+      <w:lvlJc w:val="left"/>
+      <w:pPr>
+        <w:ind w:left="1648" w:hanging="360"/>
+      </w:pPr>
+    </w:lvl>
+    <w:lvl w:ilvl="2">
+      <w:start w:val="1"/>
+      <w:numFmt w:val="lowerRoman"/>
+      <w:lvlText w:val="%3."/>
+      <w:lvlJc w:val="right"/>
+      <w:pPr>
+        <w:ind w:left="2368" w:hanging="180"/>
+      </w:pPr>
+    </w:lvl>
+    <w:lvl w:ilvl="3">
+      <w:start w:val="1"/>
+      <w:numFmt w:val="decimal"/>
+      <w:lvlText w:val="%4."/>
+      <w:lvlJc w:val="left"/>
+      <w:pPr>
+        <w:ind w:left="3088" w:hanging="360"/>
+      </w:pPr>
+    </w:lvl>
+    <w:lvl w:ilvl="4">
+      <w:start w:val="1"/>
+      <w:numFmt w:val="lowerLetter"/>
+      <w:lvlText w:val="%5."/>
+      <w:lvlJc w:val="left"/>
+      <w:pPr>
+        <w:ind w:left="3808" w:hanging="360"/>
+      </w:pPr>
+    </w:lvl>
+    <w:lvl w:ilvl="5">
+      <w:start w:val="1"/>
+      <w:numFmt w:val="lowerRoman"/>
+      <w:lvlText w:val="%6."/>
+      <w:lvlJc w:val="right"/>
+      <w:pPr>
+        <w:ind w:left="4528" w:hanging="180"/>
+      </w:pPr>
+    </w:lvl>
+    <w:lvl w:ilvl="6">
+      <w:start w:val="1"/>
+      <w:numFmt w:val="decimal"/>
+      <w:lvlText w:val="%7."/>
+      <w:lvlJc w:val="left"/>
+      <w:pPr>
+        <w:ind w:left="5248" w:hanging="360"/>
+      </w:pPr>
+    </w:lvl>
+    <w:lvl w:ilvl="7">
+      <w:start w:val="1"/>
+      <w:numFmt w:val="lowerLetter"/>
+      <w:lvlText w:val="%8."/>
+      <w:lvlJc w:val="left"/>
+      <w:pPr>
+        <w:ind w:left="5968" w:hanging="360"/>
+      </w:pPr>
+    </w:lvl>
+    <w:lvl w:ilvl="8">
+      <w:start w:val="1"/>
+      <w:numFmt w:val="lowerRoman"/>
+      <w:lvlText w:val="%9."/>
+      <w:lvlJc w:val="right"/>
+      <w:pPr>
+        <w:ind w:left="6688" w:hanging="180"/>
+      </w:pPr>
+    </w:lvl>
+  </w:abstractNum>
+  <w:abstractNum w:abstractNumId="2" w15:restartNumberingAfterBreak="0">
     <w:nsid w:val="7D28447F"/>
     <w:multiLevelType w:val="multilevel"/>
     <w:tmpl w:val="070A7468"/>
@@ -3074,7 +4286,7 @@
       <w:lvlText w:val="%1."/>
       <w:lvlJc w:val="left"/>
       <w:pPr>
-        <w:ind w:left="720" w:hanging="360"/>
+        <w:ind w:left="3196" w:hanging="360"/>
       </w:pPr>
       <w:rPr>
         <w:u w:val="none"/>
@@ -3086,7 +4298,7 @@
       <w:lvlText w:val="%2."/>
       <w:lvlJc w:val="left"/>
       <w:pPr>
-        <w:ind w:left="1440" w:hanging="360"/>
+        <w:ind w:left="3916" w:hanging="360"/>
       </w:pPr>
       <w:rPr>
         <w:u w:val="none"/>
@@ -3098,7 +4310,7 @@
       <w:lvlText w:val="%3."/>
       <w:lvlJc w:val="left"/>
       <w:pPr>
-        <w:ind w:left="2160" w:hanging="360"/>
+        <w:ind w:left="4636" w:hanging="360"/>
       </w:pPr>
       <w:rPr>
         <w:u w:val="none"/>
@@ -3110,7 +4322,7 @@
       <w:lvlText w:val="%4."/>
       <w:lvlJc w:val="left"/>
       <w:pPr>
-        <w:ind w:left="2880" w:hanging="360"/>
+        <w:ind w:left="5356" w:hanging="360"/>
       </w:pPr>
       <w:rPr>
         <w:u w:val="none"/>
@@ -3122,7 +4334,7 @@
       <w:lvlText w:val="%5."/>
       <w:lvlJc w:val="left"/>
       <w:pPr>
-        <w:ind w:left="3600" w:hanging="360"/>
+        <w:ind w:left="6076" w:hanging="360"/>
       </w:pPr>
       <w:rPr>
         <w:u w:val="none"/>
@@ -3134,7 +4346,7 @@
       <w:lvlText w:val="%6."/>
       <w:lvlJc w:val="left"/>
       <w:pPr>
-        <w:ind w:left="4320" w:hanging="360"/>
+        <w:ind w:left="6796" w:hanging="360"/>
       </w:pPr>
       <w:rPr>
         <w:u w:val="none"/>
@@ -3146,7 +4358,7 @@
       <w:lvlText w:val="%7."/>
       <w:lvlJc w:val="left"/>
       <w:pPr>
-        <w:ind w:left="5040" w:hanging="360"/>
+        <w:ind w:left="7516" w:hanging="360"/>
       </w:pPr>
       <w:rPr>
         <w:u w:val="none"/>
@@ -3158,7 +4370,7 @@
       <w:lvlText w:val="%8."/>
       <w:lvlJc w:val="left"/>
       <w:pPr>
-        <w:ind w:left="5760" w:hanging="360"/>
+        <w:ind w:left="8236" w:hanging="360"/>
       </w:pPr>
       <w:rPr>
         <w:u w:val="none"/>
@@ -3170,7 +4382,7 @@
       <w:lvlText w:val="%9."/>
       <w:lvlJc w:val="left"/>
       <w:pPr>
-        <w:ind w:left="6480" w:hanging="360"/>
+        <w:ind w:left="8956" w:hanging="360"/>
       </w:pPr>
       <w:rPr>
         <w:u w:val="none"/>
@@ -3178,7 +4390,13 @@
     </w:lvl>
   </w:abstractNum>
   <w:num w:numId="1" w16cid:durableId="1774397783">
+    <w:abstractNumId w:val="2"/>
+  </w:num>
+  <w:num w:numId="2" w16cid:durableId="1373385189">
     <w:abstractNumId w:val="0"/>
+  </w:num>
+  <w:num w:numId="3" w16cid:durableId="1384252037">
+    <w:abstractNumId w:val="1"/>
   </w:num>
 </w:numbering>
 </file>
@@ -3854,6 +5072,50 @@
       <w:szCs w:val="20"/>
     </w:rPr>
   </w:style>
+  <w:style w:type="paragraph" w:styleId="Header">
+    <w:name w:val="header"/>
+    <w:basedOn w:val="Normal"/>
+    <w:link w:val="HeaderChar"/>
+    <w:uiPriority w:val="99"/>
+    <w:unhideWhenUsed/>
+    <w:rsid w:val="00F51E3B"/>
+    <w:pPr>
+      <w:tabs>
+        <w:tab w:val="center" w:pos="4513"/>
+        <w:tab w:val="right" w:pos="9026"/>
+      </w:tabs>
+      <w:spacing w:after="0" w:line="240" w:lineRule="auto"/>
+    </w:pPr>
+  </w:style>
+  <w:style w:type="character" w:customStyle="1" w:styleId="HeaderChar">
+    <w:name w:val="Header Char"/>
+    <w:basedOn w:val="DefaultParagraphFont"/>
+    <w:link w:val="Header"/>
+    <w:uiPriority w:val="99"/>
+    <w:rsid w:val="00F51E3B"/>
+  </w:style>
+  <w:style w:type="paragraph" w:styleId="Footer">
+    <w:name w:val="footer"/>
+    <w:basedOn w:val="Normal"/>
+    <w:link w:val="FooterChar"/>
+    <w:uiPriority w:val="99"/>
+    <w:unhideWhenUsed/>
+    <w:rsid w:val="00F51E3B"/>
+    <w:pPr>
+      <w:tabs>
+        <w:tab w:val="center" w:pos="4513"/>
+        <w:tab w:val="right" w:pos="9026"/>
+      </w:tabs>
+      <w:spacing w:after="0" w:line="240" w:lineRule="auto"/>
+    </w:pPr>
+  </w:style>
+  <w:style w:type="character" w:customStyle="1" w:styleId="FooterChar">
+    <w:name w:val="Footer Char"/>
+    <w:basedOn w:val="DefaultParagraphFont"/>
+    <w:link w:val="Footer"/>
+    <w:uiPriority w:val="99"/>
+    <w:rsid w:val="00F51E3B"/>
+  </w:style>
 </w:styles>
 </file>
 
@@ -4175,4 +5437,16 @@
   </a:objectDefaults>
   <a:extraClrSchemeLst/>
 </a:theme>
+</file>
+
+<file path=customXml/item1.xml><?xml version="1.0" encoding="utf-8"?>
+<b:Sources xmlns:b="http://schemas.openxmlformats.org/officeDocument/2006/bibliography" xmlns="http://schemas.openxmlformats.org/officeDocument/2006/bibliography" SelectedStyle="\APASixthEditionOfficeOnline.xsl" StyleName="APA" Version="6"/>
+</file>
+
+<file path=customXml/itemProps1.xml><?xml version="1.0" encoding="utf-8"?>
+<ds:datastoreItem xmlns:ds="http://schemas.openxmlformats.org/officeDocument/2006/customXml" ds:itemID="{0DA81914-433E-4ABF-9E08-B188649A6688}">
+  <ds:schemaRefs>
+    <ds:schemaRef ds:uri="http://schemas.openxmlformats.org/officeDocument/2006/bibliography"/>
+  </ds:schemaRefs>
+</ds:datastoreItem>
 </file>
</xml_diff>